<commit_message>
Builder: Schalter 'Einfach & schnell halten'
</commit_message>
<xml_diff>
--- a/Feinplanung Minilektion - ausgefuellt.docx
+++ b/Feinplanung Minilektion - ausgefuellt.docx
@@ -143,7 +143,7 @@
           <w:sz w:val="22"/>
         </w:rPr>
         <w:tab/>
-        <w:t>Die Teilnehmenden können (1) erklären, was Google AI Studio ist, und zwei Beispiele nennen, was man damit bauen kann (z. B. eine Website und eine kleine App / ein Tool); (2) mit dem Prompt-Baukasten einen strukturierten Website-Auftrag zu ihrem Thema zusammenstellen; (3) diesen Prompt in Google AI Studio einfügen und eine erste Website-Vorschau erzeugen.</w:t>
+        <w:t>Die Teilnehmenden können (1) erklären, was Google AI Studio ist, und zwei Beispiele nennen, was man damit bauen kann (z. B. eine Website und eine kleine App / ein Tool); (2) mit dem Prompt-Baukasten einen strukturierten Website-Auftrag zu ihrem Thema zusammenstellen; (3) diesen Prompt in Google AI Studio einfügen und eine erste Website-Vorschau starten.</w:t>
       </w:r>
     </w:p>
     <w:tbl>
@@ -648,7 +648,7 @@
               <w:rPr>
                 <w:rFonts w:ascii="Arial" w:hAnsi="Arial" w:cs="Arial"/>
               </w:rPr>
-              <w:t>Was ist Google AI Studio; Prinzip „guter Auftrag = gutes Ergebnis“; kurze Live-Demo; Baukasten vorstellen</w:t>
+              <w:t>Was ist Google AI Studio; Prinzip „guter Auftrag = gutes Ergebnis“; Demo mit vorab generiertem Beispiel (Generierung dauert mehrere Minuten); Baukasten vorstellen</w:t>
             </w:r>
           </w:p>
         </w:tc>
@@ -750,7 +750,7 @@
               <w:rPr>
                 <w:rFonts w:ascii="Arial" w:hAnsi="Arial" w:cs="Arial"/>
               </w:rPr>
-              <w:t>Eigenen Prompt im Baukasten bauen; 1–2 zeigen ihre Website live in AI Studio</w:t>
+              <w:t>Eigenen Prompt bauen und Generierung starten (läuft weiter – nicht abwarten); 1–2 zeigen Prompt/Start</w:t>
             </w:r>
           </w:p>
         </w:tc>
@@ -852,7 +852,7 @@
               <w:rPr>
                 <w:rFonts w:ascii="Arial" w:hAnsi="Arial" w:cs="Arial"/>
               </w:rPr>
-              <w:t>Drei Schritte + zwei Bau-Beispiele nennen lassen; Fragen; Zusammenfassung und Ausblick</w:t>
+              <w:t>Drei Schritte + zwei Bau-Beispiele nennen lassen; Fragen; Zusammenfassung und Ausblick (Ergebnisse später teilen)</w:t>
             </w:r>
           </w:p>
         </w:tc>
@@ -1060,7 +1060,7 @@
           <w:b w:val="0"/>
           <w:i w:val="0"/>
         </w:rPr>
-        <w:t>: Beamer, Laptop mit Internet, WLAN; Smartphones/Laptops der Teilnehmenden; Google-Konto (AI Studio, Build-Modus); Prompt-Baukasten + QR</w:t>
+        <w:t>: Beamer, Laptop mit Internet, WLAN; Smartphones/Laptops der Teilnehmenden; Google-Konto (AI Studio, Build-Modus); Prompt-Baukasten + QR; 1–2 vorab generierte Beispiele (Screenshots)</w:t>
       </w:r>
     </w:p>
     <w:p>

</xml_diff>

<commit_message>
Feinplanung auf Slides abgestimmt (Inhalte, Reihenfolge, Zeiten 3+3+5+8+4)
</commit_message>
<xml_diff>
--- a/Feinplanung Minilektion - ausgefuellt.docx
+++ b/Feinplanung Minilektion - ausgefuellt.docx
@@ -143,7 +143,7 @@
           <w:sz w:val="22"/>
         </w:rPr>
         <w:tab/>
-        <w:t>Die Teilnehmenden können (1) erklären, was Google AI Studio ist, und zwei Beispiele nennen, was man damit bauen kann (z. B. eine Website und eine kleine App / ein Tool); (2) mit dem Prompt-Baukasten einen strukturierten Website-Auftrag zu ihrem Thema zusammenstellen; (3) diesen Prompt in Google AI Studio einfügen und eine erste Website-Vorschau starten.</w:t>
+        <w:t>Die Teilnehmenden können (1) erklären, was Google AI Studio ist, und zwei Beispiele nennen, was man damit bauen kann (z. B. eine Website und eine kleine App / ein Tool); (2) mit dem Prompt-Baukasten einen strukturierten Website-Auftrag zu ihrem Thema zusammenstellen; (3) diesen Prompt in Google AI Studio einfügen und losschicken – eine erste Website starten.</w:t>
       </w:r>
     </w:p>
     <w:tbl>
@@ -444,7 +444,7 @@
               <w:rPr>
                 <w:rFonts w:ascii="Arial" w:hAnsi="Arial" w:cs="Arial"/>
               </w:rPr>
-              <w:t>Begrüssung; Einstiegsfrage; Thema, Lernziele und Ablauf transparent machen</w:t>
+              <w:t>Begrüssung; Hook-Frage „Wie baut man 2026 eine Website – oder eine App?“; KL startet live eine Website (vorbereiteter Prompt → AI Studio → „Go“, baut ab jetzt im Hintergrund); Ablauf und die 3 Lernziele zeigen</w:t>
             </w:r>
           </w:p>
         </w:tc>
@@ -464,7 +464,7 @@
               <w:rPr>
                 <w:rFonts w:ascii="Arial" w:hAnsi="Arial" w:cs="Arial"/>
               </w:rPr>
-              <w:t>Lehrgespräch, Impulsfrage (Plenum)</w:t>
+              <w:t>Lehrgespräch, Live-Demo (Plenum)</w:t>
             </w:r>
           </w:p>
         </w:tc>
@@ -484,7 +484,7 @@
               <w:rPr>
                 <w:rFonts w:ascii="Arial" w:hAnsi="Arial" w:cs="Arial"/>
               </w:rPr>
-              <w:t>Zielplakat / Folie</w:t>
+              <w:t>Beamer, AI Studio, Folien 1–3</w:t>
             </w:r>
           </w:p>
         </w:tc>
@@ -546,7 +546,7 @@
               <w:rPr>
                 <w:rFonts w:ascii="Arial" w:hAnsi="Arial" w:cs="Arial"/>
               </w:rPr>
-              <w:t>An KI-Erfahrung anknüpfen (Handzeichen); Brücke: KI baut ganze Websites</w:t>
+              <w:t>„Hand hoch: Wer hat schon mal eine KI etwas gefragt?“ (ChatGPT, Gemini …); Brücke: KI schreibt nicht nur Texte – sie baut ganze Websites</w:t>
             </w:r>
           </w:p>
         </w:tc>
@@ -566,7 +566,7 @@
               <w:rPr>
                 <w:rFonts w:ascii="Arial" w:hAnsi="Arial" w:cs="Arial"/>
               </w:rPr>
-              <w:t>Aktivierende Fragen (Plenum)</w:t>
+              <w:t>Aktivierende Frage, Handzeichen (Plenum)</w:t>
             </w:r>
           </w:p>
         </w:tc>
@@ -586,7 +586,7 @@
               <w:rPr>
                 <w:rFonts w:ascii="Arial" w:hAnsi="Arial" w:cs="Arial"/>
               </w:rPr>
-              <w:t>Beamer</w:t>
+              <w:t>Folie 4</w:t>
             </w:r>
           </w:p>
         </w:tc>
@@ -648,7 +648,7 @@
               <w:rPr>
                 <w:rFonts w:ascii="Arial" w:hAnsi="Arial" w:cs="Arial"/>
               </w:rPr>
-              <w:t>Was ist Google AI Studio; Prinzip „guter Auftrag = gutes Ergebnis“; Demo mit vorab generiertem Beispiel (Generierung dauert mehrere Minuten); Baukasten vorstellen</w:t>
+              <w:t>Was ist AI Studio: Websites &amp; kleine Apps bauen, beschreiben statt programmieren, kostenlos im Browser, anschauen &amp; anpassen; Prinzip „Ein guter Auftrag = ein gutes Ergebnis“; die 3 Schritte am Baukasten zeigen (Prompt entsteht sofort, Bau dauert Minuten)</w:t>
             </w:r>
           </w:p>
         </w:tc>
@@ -688,7 +688,7 @@
               <w:rPr>
                 <w:rFonts w:ascii="Arial" w:hAnsi="Arial" w:cs="Arial"/>
               </w:rPr>
-              <w:t>Beamer, Prompt-Baukasten, QR-Code</w:t>
+              <w:t>Beamer, Prompt-Baukasten, Folien 5–7</w:t>
             </w:r>
           </w:p>
         </w:tc>
@@ -750,7 +750,7 @@
               <w:rPr>
                 <w:rFonts w:ascii="Arial" w:hAnsi="Arial" w:cs="Arial"/>
               </w:rPr>
-              <w:t>Eigenen Prompt bauen (Tipp: Schalter „Einfach &amp; schnell“) und Generierung starten (läuft weiter – nicht abwarten); 1–2 zeigen Prompt/Start</w:t>
+              <w:t>TN öffnen den Baukasten (QR), füllen ihn für die eigene Idee aus, kopieren den Prompt, fügen ihn in AI Studio ein und starten; während es baut: kurzer Austausch zu zweit, KL begleitet; Link später im Gruppenchat</w:t>
             </w:r>
           </w:p>
         </w:tc>
@@ -770,7 +770,7 @@
               <w:rPr>
                 <w:rFonts w:ascii="Arial" w:hAnsi="Arial" w:cs="Arial"/>
               </w:rPr>
-              <w:t>Einzel-/Partnerarbeit, anschl. Plenums-Demo</w:t>
+              <w:t>Einzel-/Partnerarbeit, Murmelrunde</w:t>
             </w:r>
           </w:p>
         </w:tc>
@@ -790,7 +790,7 @@
               <w:rPr>
                 <w:rFonts w:ascii="Arial" w:hAnsi="Arial" w:cs="Arial"/>
               </w:rPr>
-              <w:t>Geräte der TN, WLAN, Handout, Beamer</w:t>
+              <w:t>Geräte der TN, WLAN, Handout, Folie 8</w:t>
             </w:r>
           </w:p>
         </w:tc>
@@ -852,7 +852,7 @@
               <w:rPr>
                 <w:rFonts w:ascii="Arial" w:hAnsi="Arial" w:cs="Arial"/>
               </w:rPr>
-              <w:t>Drei Schritte + zwei Bau-Beispiele nennen lassen; Fragen; Zusammenfassung und Ausblick (Ergebnisse später teilen)</w:t>
+              <w:t>Enthüllung der live gebauten Website (Tab-Wechsel; ~17 Min alt → fertig); „Was bleibt hängen?“: die 3 Schritte wiederholen, Lernzielkontrolle (Was ist AI Studio? zwei Bau-Beispiele; Wofür würdest du eine Website bauen?); Fragen; Abschluss: Ergebnisse zeigen (fertig oder in Arbeit), Link im Gruppenchat teilen, Dank</w:t>
             </w:r>
           </w:p>
         </w:tc>
@@ -872,7 +872,7 @@
               <w:rPr>
                 <w:rFonts w:ascii="Arial" w:hAnsi="Arial" w:cs="Arial"/>
               </w:rPr>
-              <w:t>Murmelrunde, Plenum</w:t>
+              <w:t>Plenum, Murmelrunde</w:t>
             </w:r>
           </w:p>
         </w:tc>
@@ -892,7 +892,7 @@
               <w:rPr>
                 <w:rFonts w:ascii="Arial" w:hAnsi="Arial" w:cs="Arial"/>
               </w:rPr>
-              <w:t>Folie</w:t>
+              <w:t>Beamer, Folien 9–10</w:t>
             </w:r>
           </w:p>
         </w:tc>
@@ -998,7 +998,7 @@
           <w:b w:val="0"/>
           <w:i w:val="0"/>
         </w:rPr>
-        <w:t>: 3 Lernziele (Folie / Flipchart)</w:t>
+        <w:t>: 3 Lernziele (Folie 3)</w:t>
       </w:r>
     </w:p>
     <w:p>
@@ -1029,7 +1029,7 @@
           <w:b w:val="0"/>
           <w:i w:val="0"/>
         </w:rPr>
-        <w:t>: Ablauf ARIVA – 5 Phasen mit Zeiten (Folie)</w:t>
+        <w:t>: Ablauf ARIVA – 5 Phasen mit Zeiten (Folie 2)</w:t>
       </w:r>
     </w:p>
     <w:p>
@@ -1060,7 +1060,7 @@
           <w:b w:val="0"/>
           <w:i w:val="0"/>
         </w:rPr>
-        <w:t>: Beamer, Laptop mit Internet, WLAN; Smartphones/Laptops der Teilnehmenden; Google-Konto (AI Studio, Build-Modus); Prompt-Baukasten + QR; 1–2 vorab generierte Beispiele (Screenshots)</w:t>
+        <w:t>: Beamer, Laptop mit Internet, WLAN; Smartphones/Laptops der Teilnehmenden; Google-Konto (AI Studio, Build-Modus); vorbereiteter Prompt für die Live-Demo; Prompt-Baukasten + QR; Foliensatz (10 Folien); Backup: fertige eigene Seite (Fuchs Communications)</w:t>
       </w:r>
     </w:p>
     <w:p>

</xml_diff>